<commit_message>
Deployed b99b060 with MkDocs version: 1.6.1
</commit_message>
<xml_diff>
--- a/Buch Camille Chronicles/Melodies.docx
+++ b/Buch Camille Chronicles/Melodies.docx
@@ -4,24 +4,69 @@
   <w:body>
     <w:p>
       <w:pPr>
+        <w:pStyle w:val="berschrift1"/>
+        <w:rPr>
+          <w:lang w:val="en-US"/>
+        </w:rPr>
+      </w:pPr>
+      <w:r>
+        <w:rPr>
+          <w:lang w:val="en-US"/>
+        </w:rPr>
+        <w:t>Melodies</w:t>
+      </w:r>
+    </w:p>
+    <w:p>
+      <w:pPr>
+        <w:rPr>
+          <w:lang w:val="en-US"/>
+        </w:rPr>
+      </w:pPr>
+      <w:r>
+        <w:rPr>
+          <w:lang w:val="en-US"/>
+        </w:rPr>
+        <w:t xml:space="preserve">Melodies are a short assortment of tones that activate the Soulstice powers between Harmonist and Stice. </w:t>
+      </w:r>
+    </w:p>
+    <w:p>
+      <w:pPr>
+        <w:rPr>
+          <w:lang w:val="en-US"/>
+        </w:rPr>
+      </w:pPr>
+      <w:r>
+        <w:rPr>
+          <w:lang w:val="en-US"/>
+        </w:rPr>
+        <w:t>Is the bond of trust between Harmonist and Stice perfect, then they might play the Melodies with even greater effect and control, their passive senses and abilities even greater thatn before.</w:t>
+      </w:r>
+    </w:p>
+    <w:p>
+      <w:pPr>
+        <w:rPr>
+          <w:lang w:val="en-US"/>
+        </w:rPr>
+      </w:pPr>
+      <w:r>
+        <w:rPr>
+          <w:lang w:val="en-US"/>
+        </w:rPr>
+        <w:t>The Melodies of a specific Soulstice combine into a song that can be added upon in either direction. Though the song does have an end if all Melodies are discovered and learned by a Harmonist and played in the right order right behind each other. Then the Harmonist is truly ascended and can use the song freely to combine powers as they wish as well as gain special specific abilities depending on their Soulstice type.</w:t>
+      </w:r>
+    </w:p>
+    <w:p>
+      <w:pPr>
         <w:pStyle w:val="berschrift2"/>
         <w:rPr>
           <w:lang w:val="en-US"/>
         </w:rPr>
       </w:pPr>
-      <w:proofErr w:type="spellStart"/>
-      <w:r>
-        <w:rPr>
-          <w:lang w:val="en-US"/>
-        </w:rPr>
-        <w:t>Aikstice</w:t>
-      </w:r>
-      <w:proofErr w:type="spellEnd"/>
-      <w:r>
-        <w:rPr>
-          <w:lang w:val="en-US"/>
-        </w:rPr>
-        <w:t xml:space="preserve"> </w:t>
+      <w:r>
+        <w:rPr>
+          <w:lang w:val="en-US"/>
+        </w:rPr>
+        <w:t xml:space="preserve">Aikstice </w:t>
       </w:r>
     </w:p>
     <w:p>
@@ -95,7 +140,19 @@
         <w:rPr>
           <w:lang w:val="en-US"/>
         </w:rPr>
-        <w:t>The body loses weight, but not mass. Flesh and skin stretch to catch wind to float and soar in the right winds.</w:t>
+        <w:t xml:space="preserve">The body </w:t>
+      </w:r>
+      <w:r>
+        <w:rPr>
+          <w:lang w:val="en-US"/>
+        </w:rPr>
+        <w:t xml:space="preserve">and anything it touches </w:t>
+      </w:r>
+      <w:r>
+        <w:rPr>
+          <w:lang w:val="en-US"/>
+        </w:rPr>
+        <w:t>loses weight, but not mass. Flesh and skin stretch to catch wind to float and soar in the right winds.</w:t>
       </w:r>
     </w:p>
     <w:p>
@@ -225,14 +282,147 @@
           <w:lang w:val="en-US"/>
         </w:rPr>
       </w:pPr>
-      <w:proofErr w:type="spellStart"/>
+      <w:r>
+        <w:rPr>
+          <w:lang w:val="en-US"/>
+        </w:rPr>
+        <w:lastRenderedPageBreak/>
+        <w:t>Kerstice</w:t>
+      </w:r>
+    </w:p>
+    <w:p>
+      <w:pPr>
+        <w:pStyle w:val="berschrift3"/>
+        <w:rPr>
+          <w:lang w:val="en-US"/>
+        </w:rPr>
+      </w:pPr>
+      <w:r>
+        <w:rPr>
+          <w:lang w:val="en-US"/>
+        </w:rPr>
+        <w:t>Sculpt</w:t>
+      </w:r>
+    </w:p>
+    <w:p>
+      <w:pPr>
+        <w:rPr>
+          <w:lang w:val="en-US"/>
+        </w:rPr>
+      </w:pPr>
+      <w:r>
+        <w:rPr>
+          <w:lang w:val="en-US"/>
+        </w:rPr>
+        <w:t>Lets the Harmonist amass and form stone and similar material into shapes of their will.</w:t>
+      </w:r>
+    </w:p>
+    <w:p>
+      <w:pPr>
+        <w:pStyle w:val="berschrift3"/>
+        <w:rPr>
+          <w:lang w:val="en-US"/>
+        </w:rPr>
+      </w:pPr>
+      <w:r>
+        <w:rPr>
+          <w:lang w:val="en-US"/>
+        </w:rPr>
+        <w:t>Toss</w:t>
+      </w:r>
+    </w:p>
+    <w:p>
+      <w:pPr>
+        <w:rPr>
+          <w:lang w:val="en-US"/>
+        </w:rPr>
+      </w:pPr>
+      <w:r>
+        <w:rPr>
+          <w:lang w:val="en-US"/>
+        </w:rPr>
+        <w:t>Gathers an amount of stoney substance</w:t>
+      </w:r>
+      <w:r>
+        <w:rPr>
+          <w:lang w:val="en-US"/>
+        </w:rPr>
+        <w:t xml:space="preserve"> in the Harmonist’s hand</w:t>
+      </w:r>
+      <w:r>
+        <w:rPr>
+          <w:lang w:val="en-US"/>
+        </w:rPr>
+        <w:t xml:space="preserve"> that needs to be immediately flung in a direction.</w:t>
+      </w:r>
+    </w:p>
+    <w:p>
+      <w:pPr>
+        <w:pStyle w:val="berschrift3"/>
+        <w:rPr>
+          <w:lang w:val="en-US"/>
+        </w:rPr>
+      </w:pPr>
+      <w:r>
+        <w:rPr>
+          <w:lang w:val="en-US"/>
+        </w:rPr>
+        <w:t>Sink</w:t>
+      </w:r>
+    </w:p>
+    <w:p>
+      <w:pPr>
+        <w:rPr>
+          <w:lang w:val="en-US"/>
+        </w:rPr>
+      </w:pPr>
+      <w:r>
+        <w:rPr>
+          <w:lang w:val="en-US"/>
+        </w:rPr>
+        <w:t>Makes the ground that is touched by the Harmonist like quick sand, making anything heavy enough, except for themselves, sink quickly into the ground. Has a few meters radius.</w:t>
+      </w:r>
+    </w:p>
+    <w:p>
+      <w:pPr>
+        <w:pStyle w:val="berschrift3"/>
+        <w:rPr>
+          <w:lang w:val="en-US"/>
+        </w:rPr>
+      </w:pPr>
+      <w:r>
+        <w:rPr>
+          <w:lang w:val="en-US"/>
+        </w:rPr>
+        <w:t>Smasher</w:t>
+      </w:r>
+    </w:p>
+    <w:p>
+      <w:pPr>
+        <w:rPr>
+          <w:lang w:val="en-US"/>
+        </w:rPr>
+      </w:pPr>
+      <w:r>
+        <w:rPr>
+          <w:lang w:val="en-US"/>
+        </w:rPr>
+        <w:t>Forms hammer like stone patterns around appendages of choice, which are light enough to the Harmonist to use.</w:t>
+      </w:r>
+    </w:p>
+    <w:p>
+      <w:pPr>
+        <w:pStyle w:val="berschrift2"/>
+        <w:rPr>
+          <w:lang w:val="en-US"/>
+        </w:rPr>
+      </w:pPr>
       <w:r>
         <w:rPr>
           <w:lang w:val="en-US"/>
         </w:rPr>
         <w:t>Vrastice</w:t>
       </w:r>
-      <w:proofErr w:type="spellEnd"/>
     </w:p>
     <w:p>
       <w:pPr>
@@ -315,14 +505,12 @@
           <w:lang w:val="en-US"/>
         </w:rPr>
       </w:pPr>
-      <w:proofErr w:type="spellStart"/>
       <w:r>
         <w:rPr>
           <w:lang w:val="en-US"/>
         </w:rPr>
         <w:t>Mishstice</w:t>
       </w:r>
-      <w:proofErr w:type="spellEnd"/>
     </w:p>
     <w:p>
       <w:pPr>
@@ -362,21 +550,89 @@
         <w:rPr>
           <w:lang w:val="en-US"/>
         </w:rPr>
+        <w:t>Flow</w:t>
+      </w:r>
+    </w:p>
+    <w:p>
+      <w:pPr>
+        <w:rPr>
+          <w:lang w:val="en-US"/>
+        </w:rPr>
+      </w:pPr>
+      <w:r>
+        <w:rPr>
+          <w:lang w:val="en-US"/>
+        </w:rPr>
+        <w:t>Creating a batch of flowing metal that can be formed and hardened by will.</w:t>
+      </w:r>
+    </w:p>
+    <w:p>
+      <w:pPr>
+        <w:pStyle w:val="berschrift2"/>
+        <w:rPr>
+          <w:lang w:val="en-US"/>
+        </w:rPr>
+      </w:pPr>
+      <w:r>
+        <w:rPr>
+          <w:lang w:val="en-US"/>
+        </w:rPr>
+        <w:t>Tristice</w:t>
+      </w:r>
+    </w:p>
+    <w:p>
+      <w:pPr>
+        <w:pStyle w:val="berschrift3"/>
+        <w:rPr>
+          <w:lang w:val="en-US"/>
+        </w:rPr>
+      </w:pPr>
+      <w:r>
+        <w:rPr>
+          <w:lang w:val="en-US"/>
+        </w:rPr>
+        <w:t>Rush</w:t>
+      </w:r>
+    </w:p>
+    <w:p>
+      <w:pPr>
+        <w:rPr>
+          <w:lang w:val="en-US"/>
+        </w:rPr>
+      </w:pPr>
+      <w:r>
+        <w:rPr>
+          <w:lang w:val="en-US"/>
+        </w:rPr>
+        <w:t>A powerful flow of water from an object or spot that can be redirected, strengthened or weakened.</w:t>
+      </w:r>
+    </w:p>
+    <w:p>
+      <w:pPr>
+        <w:pStyle w:val="berschrift3"/>
+        <w:rPr>
+          <w:lang w:val="en-US"/>
+        </w:rPr>
+      </w:pPr>
+      <w:r>
+        <w:rPr>
+          <w:lang w:val="en-US"/>
+        </w:rPr>
         <w:lastRenderedPageBreak/>
-        <w:t>Flow</w:t>
-      </w:r>
-    </w:p>
-    <w:p>
-      <w:pPr>
-        <w:rPr>
-          <w:lang w:val="en-US"/>
-        </w:rPr>
-      </w:pPr>
-      <w:r>
-        <w:rPr>
-          <w:lang w:val="en-US"/>
-        </w:rPr>
-        <w:t>Creating a batch of flowing metal that can be formed and hardened by will.</w:t>
+        <w:t>Cease</w:t>
+      </w:r>
+    </w:p>
+    <w:p>
+      <w:pPr>
+        <w:rPr>
+          <w:lang w:val="en-US"/>
+        </w:rPr>
+      </w:pPr>
+      <w:r>
+        <w:rPr>
+          <w:lang w:val="en-US"/>
+        </w:rPr>
+        <w:t>Freezes any instances of bodies of water in the vicinity to ice. Hard to control and steer. Usually a radius around the Harmonist, depending on strength of Melody.</w:t>
       </w:r>
     </w:p>
     <w:p>
@@ -386,14 +642,12 @@
           <w:lang w:val="en-US"/>
         </w:rPr>
       </w:pPr>
-      <w:proofErr w:type="spellStart"/>
-      <w:r>
-        <w:rPr>
-          <w:lang w:val="en-US"/>
-        </w:rPr>
-        <w:t>Tristice</w:t>
-      </w:r>
-      <w:proofErr w:type="spellEnd"/>
+      <w:r>
+        <w:rPr>
+          <w:lang w:val="en-US"/>
+        </w:rPr>
+        <w:t>Vaostice</w:t>
+      </w:r>
     </w:p>
     <w:p>
       <w:pPr>
@@ -406,20 +660,20 @@
         <w:rPr>
           <w:lang w:val="en-US"/>
         </w:rPr>
-        <w:t>Rush</w:t>
-      </w:r>
-    </w:p>
-    <w:p>
-      <w:pPr>
-        <w:rPr>
-          <w:lang w:val="en-US"/>
-        </w:rPr>
-      </w:pPr>
-      <w:r>
-        <w:rPr>
-          <w:lang w:val="en-US"/>
-        </w:rPr>
-        <w:t>A powerful flow of water from an object or spot that can be redirected, strengthened or weakened.</w:t>
+        <w:t>Shkarhound</w:t>
+      </w:r>
+    </w:p>
+    <w:p>
+      <w:pPr>
+        <w:rPr>
+          <w:lang w:val="en-US"/>
+        </w:rPr>
+      </w:pPr>
+      <w:r>
+        <w:rPr>
+          <w:lang w:val="en-US"/>
+        </w:rPr>
+        <w:t>Transformation into a Shkarhound</w:t>
       </w:r>
     </w:p>
     <w:p>
@@ -433,20 +687,20 @@
         <w:rPr>
           <w:lang w:val="en-US"/>
         </w:rPr>
-        <w:t>Cease</w:t>
-      </w:r>
-    </w:p>
-    <w:p>
-      <w:pPr>
-        <w:rPr>
-          <w:lang w:val="en-US"/>
-        </w:rPr>
-      </w:pPr>
-      <w:r>
-        <w:rPr>
-          <w:lang w:val="en-US"/>
-        </w:rPr>
-        <w:t>Freezes any instances of bodies of water in the vicinity to ice. Hard to control and steer. Usually a radius around the Harmonist, depending on strength of Melody.</w:t>
+        <w:t>Shiron</w:t>
+      </w:r>
+    </w:p>
+    <w:p>
+      <w:pPr>
+        <w:rPr>
+          <w:lang w:val="en-US"/>
+        </w:rPr>
+      </w:pPr>
+      <w:r>
+        <w:rPr>
+          <w:lang w:val="en-US"/>
+        </w:rPr>
+        <w:t>Transformation into a Shiron</w:t>
       </w:r>
     </w:p>
     <w:p>
@@ -456,94 +710,12 @@
           <w:lang w:val="en-US"/>
         </w:rPr>
       </w:pPr>
-      <w:proofErr w:type="spellStart"/>
-      <w:r>
-        <w:rPr>
-          <w:lang w:val="en-US"/>
-        </w:rPr>
-        <w:t>Vaostice</w:t>
-      </w:r>
-      <w:proofErr w:type="spellEnd"/>
-    </w:p>
-    <w:p>
-      <w:pPr>
-        <w:pStyle w:val="berschrift3"/>
-        <w:rPr>
-          <w:lang w:val="en-US"/>
-        </w:rPr>
-      </w:pPr>
-      <w:proofErr w:type="spellStart"/>
-      <w:r>
-        <w:rPr>
-          <w:lang w:val="en-US"/>
-        </w:rPr>
-        <w:t>Shkarhound</w:t>
-      </w:r>
-      <w:proofErr w:type="spellEnd"/>
-    </w:p>
-    <w:p>
-      <w:pPr>
-        <w:rPr>
-          <w:lang w:val="en-US"/>
-        </w:rPr>
-      </w:pPr>
-      <w:r>
-        <w:rPr>
-          <w:lang w:val="en-US"/>
-        </w:rPr>
-        <w:t xml:space="preserve">Transformation into a </w:t>
-      </w:r>
-      <w:proofErr w:type="spellStart"/>
-      <w:r>
-        <w:rPr>
-          <w:lang w:val="en-US"/>
-        </w:rPr>
-        <w:t>Shkarhound</w:t>
-      </w:r>
-      <w:proofErr w:type="spellEnd"/>
-    </w:p>
-    <w:p>
-      <w:pPr>
-        <w:pStyle w:val="berschrift3"/>
-        <w:rPr>
-          <w:lang w:val="en-US"/>
-        </w:rPr>
-      </w:pPr>
-      <w:r>
-        <w:rPr>
-          <w:lang w:val="en-US"/>
-        </w:rPr>
-        <w:t>Shiron</w:t>
-      </w:r>
-    </w:p>
-    <w:p>
-      <w:pPr>
-        <w:rPr>
-          <w:lang w:val="en-US"/>
-        </w:rPr>
-      </w:pPr>
-      <w:r>
-        <w:rPr>
-          <w:lang w:val="en-US"/>
-        </w:rPr>
-        <w:t>Transformation into a Shiron</w:t>
-      </w:r>
-    </w:p>
-    <w:p>
-      <w:pPr>
-        <w:pStyle w:val="berschrift2"/>
-        <w:rPr>
-          <w:lang w:val="en-US"/>
-        </w:rPr>
-      </w:pPr>
-      <w:proofErr w:type="spellStart"/>
       <w:r>
         <w:rPr>
           <w:lang w:val="en-US"/>
         </w:rPr>
         <w:t>Rustice</w:t>
       </w:r>
-      <w:proofErr w:type="spellEnd"/>
     </w:p>
     <w:p>
       <w:pPr>

</xml_diff>

<commit_message>
Deployed 9862510 with MkDocs version: 1.6.1
</commit_message>
<xml_diff>
--- a/Buch Camille Chronicles/Melodies.docx
+++ b/Buch Camille Chronicles/Melodies.docx
@@ -26,33 +26,89 @@
         <w:rPr>
           <w:lang w:val="en-US"/>
         </w:rPr>
-        <w:t xml:space="preserve">Melodies are a short assortment of tones that activate the Soulstice powers between Harmonist and Stice. </w:t>
-      </w:r>
-    </w:p>
-    <w:p>
-      <w:pPr>
-        <w:rPr>
-          <w:lang w:val="en-US"/>
-        </w:rPr>
-      </w:pPr>
-      <w:r>
-        <w:rPr>
-          <w:lang w:val="en-US"/>
-        </w:rPr>
-        <w:t>Is the bond of trust between Harmonist and Stice perfect, then they might play the Melodies with even greater effect and control, their passive senses and abilities even greater thatn before.</w:t>
-      </w:r>
-    </w:p>
-    <w:p>
-      <w:pPr>
-        <w:rPr>
-          <w:lang w:val="en-US"/>
-        </w:rPr>
-      </w:pPr>
-      <w:r>
-        <w:rPr>
-          <w:lang w:val="en-US"/>
-        </w:rPr>
-        <w:t>The Melodies of a specific Soulstice combine into a song that can be added upon in either direction. Though the song does have an end if all Melodies are discovered and learned by a Harmonist and played in the right order right behind each other. Then the Harmonist is truly ascended and can use the song freely to combine powers as they wish as well as gain special specific abilities depending on their Soulstice type.</w:t>
+        <w:t xml:space="preserve">Melodies are a short assortment of tones that activate the </w:t>
+      </w:r>
+      <w:proofErr w:type="spellStart"/>
+      <w:r>
+        <w:rPr>
+          <w:lang w:val="en-US"/>
+        </w:rPr>
+        <w:t>Soulstice</w:t>
+      </w:r>
+      <w:proofErr w:type="spellEnd"/>
+      <w:r>
+        <w:rPr>
+          <w:lang w:val="en-US"/>
+        </w:rPr>
+        <w:t xml:space="preserve"> powers between Harmonist and Stice. </w:t>
+      </w:r>
+    </w:p>
+    <w:p>
+      <w:pPr>
+        <w:rPr>
+          <w:lang w:val="en-US"/>
+        </w:rPr>
+      </w:pPr>
+      <w:r>
+        <w:rPr>
+          <w:lang w:val="en-US"/>
+        </w:rPr>
+        <w:t xml:space="preserve">Is the bond of trust between Harmonist and Stice perfect, then they might play the Melodies with even greater effect and control, their passive senses and abilities even greater </w:t>
+      </w:r>
+      <w:proofErr w:type="spellStart"/>
+      <w:r>
+        <w:rPr>
+          <w:lang w:val="en-US"/>
+        </w:rPr>
+        <w:t>thatn</w:t>
+      </w:r>
+      <w:proofErr w:type="spellEnd"/>
+      <w:r>
+        <w:rPr>
+          <w:lang w:val="en-US"/>
+        </w:rPr>
+        <w:t xml:space="preserve"> before.</w:t>
+      </w:r>
+    </w:p>
+    <w:p>
+      <w:pPr>
+        <w:rPr>
+          <w:lang w:val="en-US"/>
+        </w:rPr>
+      </w:pPr>
+      <w:r>
+        <w:rPr>
+          <w:lang w:val="en-US"/>
+        </w:rPr>
+        <w:t xml:space="preserve">The Melodies of a specific </w:t>
+      </w:r>
+      <w:proofErr w:type="spellStart"/>
+      <w:r>
+        <w:rPr>
+          <w:lang w:val="en-US"/>
+        </w:rPr>
+        <w:t>Soulstice</w:t>
+      </w:r>
+      <w:proofErr w:type="spellEnd"/>
+      <w:r>
+        <w:rPr>
+          <w:lang w:val="en-US"/>
+        </w:rPr>
+        <w:t xml:space="preserve"> combine into a song that can be added upon in either direction. Though the song does have an end if all Melodies are discovered and learned by a Harmonist and played in the right order right behind each other. Then the Harmonist is truly ascended and can use the song freely to combine powers as they wish as well as gain special specific abilities depending on their </w:t>
+      </w:r>
+      <w:proofErr w:type="spellStart"/>
+      <w:r>
+        <w:rPr>
+          <w:lang w:val="en-US"/>
+        </w:rPr>
+        <w:t>Soulstice</w:t>
+      </w:r>
+      <w:proofErr w:type="spellEnd"/>
+      <w:r>
+        <w:rPr>
+          <w:lang w:val="en-US"/>
+        </w:rPr>
+        <w:t xml:space="preserve"> type.</w:t>
       </w:r>
     </w:p>
     <w:p>
@@ -62,11 +118,19 @@
           <w:lang w:val="en-US"/>
         </w:rPr>
       </w:pPr>
-      <w:r>
-        <w:rPr>
-          <w:lang w:val="en-US"/>
-        </w:rPr>
-        <w:t xml:space="preserve">Aikstice </w:t>
+      <w:proofErr w:type="spellStart"/>
+      <w:r>
+        <w:rPr>
+          <w:lang w:val="en-US"/>
+        </w:rPr>
+        <w:t>Aikstice</w:t>
+      </w:r>
+      <w:proofErr w:type="spellEnd"/>
+      <w:r>
+        <w:rPr>
+          <w:lang w:val="en-US"/>
+        </w:rPr>
+        <w:t xml:space="preserve"> </w:t>
       </w:r>
     </w:p>
     <w:p>
@@ -146,7 +210,21 @@
         <w:rPr>
           <w:lang w:val="en-US"/>
         </w:rPr>
-        <w:t xml:space="preserve">and anything it touches </w:t>
+        <w:t xml:space="preserve">and anything it </w:t>
+      </w:r>
+      <w:proofErr w:type="gramStart"/>
+      <w:r>
+        <w:rPr>
+          <w:lang w:val="en-US"/>
+        </w:rPr>
+        <w:t>touches</w:t>
+      </w:r>
+      <w:proofErr w:type="gramEnd"/>
+      <w:r>
+        <w:rPr>
+          <w:lang w:val="en-US"/>
+        </w:rPr>
+        <w:t xml:space="preserve"> </w:t>
       </w:r>
       <w:r>
         <w:rPr>
@@ -282,6 +360,8 @@
           <w:lang w:val="en-US"/>
         </w:rPr>
       </w:pPr>
+      <w:bookmarkStart w:id="0" w:name="_Hlk234175724"/>
+      <w:proofErr w:type="spellStart"/>
       <w:r>
         <w:rPr>
           <w:lang w:val="en-US"/>
@@ -289,7 +369,9 @@
         <w:lastRenderedPageBreak/>
         <w:t>Kerstice</w:t>
       </w:r>
-    </w:p>
+      <w:proofErr w:type="spellEnd"/>
+    </w:p>
+    <w:bookmarkEnd w:id="0"/>
     <w:p>
       <w:pPr>
         <w:pStyle w:val="berschrift3"/>
@@ -310,11 +392,21 @@
           <w:lang w:val="en-US"/>
         </w:rPr>
       </w:pPr>
-      <w:r>
-        <w:rPr>
-          <w:lang w:val="en-US"/>
-        </w:rPr>
-        <w:t>Lets the Harmonist amass and form stone and similar material into shapes of their will.</w:t>
+      <w:proofErr w:type="spellStart"/>
+      <w:proofErr w:type="gramStart"/>
+      <w:r>
+        <w:rPr>
+          <w:lang w:val="en-US"/>
+        </w:rPr>
+        <w:t>Lets</w:t>
+      </w:r>
+      <w:proofErr w:type="spellEnd"/>
+      <w:proofErr w:type="gramEnd"/>
+      <w:r>
+        <w:rPr>
+          <w:lang w:val="en-US"/>
+        </w:rPr>
+        <w:t xml:space="preserve"> the Harmonist amass and form stone and similar material into shapes of their will.</w:t>
       </w:r>
     </w:p>
     <w:p>
@@ -407,7 +499,52 @@
         <w:rPr>
           <w:lang w:val="en-US"/>
         </w:rPr>
-        <w:t>Forms hammer like stone patterns around appendages of choice, which are light enough to the Harmonist to use.</w:t>
+        <w:t>Forms stone patterns around appendages of choice, which are light enough to the Harmonist to use</w:t>
+      </w:r>
+      <w:r>
+        <w:rPr>
+          <w:lang w:val="en-US"/>
+        </w:rPr>
+        <w:t xml:space="preserve"> in battle</w:t>
+      </w:r>
+      <w:r>
+        <w:rPr>
+          <w:lang w:val="en-US"/>
+        </w:rPr>
+        <w:t>.</w:t>
+      </w:r>
+      <w:r>
+        <w:rPr>
+          <w:lang w:val="en-US"/>
+        </w:rPr>
+        <w:t xml:space="preserve"> Armor, hammers, spikes etc.</w:t>
+      </w:r>
+    </w:p>
+    <w:p>
+      <w:pPr>
+        <w:pStyle w:val="berschrift3"/>
+        <w:rPr>
+          <w:lang w:val="en-US"/>
+        </w:rPr>
+      </w:pPr>
+      <w:r>
+        <w:rPr>
+          <w:lang w:val="en-US"/>
+        </w:rPr>
+        <w:t>Rise</w:t>
+      </w:r>
+    </w:p>
+    <w:p>
+      <w:pPr>
+        <w:rPr>
+          <w:lang w:val="en-US"/>
+        </w:rPr>
+      </w:pPr>
+      <w:r>
+        <w:rPr>
+          <w:lang w:val="en-US"/>
+        </w:rPr>
+        <w:t>Lifts ground into the air while it still ahs to hold contact with the Harmonist. Interconnection between stones and earth still continues, that’s why a massive wave of sand can be formed as well.</w:t>
       </w:r>
     </w:p>
     <w:p>
@@ -417,12 +554,14 @@
           <w:lang w:val="en-US"/>
         </w:rPr>
       </w:pPr>
+      <w:proofErr w:type="spellStart"/>
       <w:r>
         <w:rPr>
           <w:lang w:val="en-US"/>
         </w:rPr>
         <w:t>Vrastice</w:t>
       </w:r>
+      <w:proofErr w:type="spellEnd"/>
     </w:p>
     <w:p>
       <w:pPr>
@@ -505,12 +644,14 @@
           <w:lang w:val="en-US"/>
         </w:rPr>
       </w:pPr>
+      <w:proofErr w:type="spellStart"/>
       <w:r>
         <w:rPr>
           <w:lang w:val="en-US"/>
         </w:rPr>
         <w:t>Mishstice</w:t>
       </w:r>
+      <w:proofErr w:type="spellEnd"/>
     </w:p>
     <w:p>
       <w:pPr>
@@ -573,12 +714,15 @@
           <w:lang w:val="en-US"/>
         </w:rPr>
       </w:pPr>
-      <w:r>
-        <w:rPr>
-          <w:lang w:val="en-US"/>
-        </w:rPr>
+      <w:proofErr w:type="spellStart"/>
+      <w:r>
+        <w:rPr>
+          <w:lang w:val="en-US"/>
+        </w:rPr>
+        <w:lastRenderedPageBreak/>
         <w:t>Tristice</w:t>
       </w:r>
+      <w:proofErr w:type="spellEnd"/>
     </w:p>
     <w:p>
       <w:pPr>
@@ -618,7 +762,6 @@
         <w:rPr>
           <w:lang w:val="en-US"/>
         </w:rPr>
-        <w:lastRenderedPageBreak/>
         <w:t>Cease</w:t>
       </w:r>
     </w:p>
@@ -642,12 +785,14 @@
           <w:lang w:val="en-US"/>
         </w:rPr>
       </w:pPr>
+      <w:proofErr w:type="spellStart"/>
       <w:r>
         <w:rPr>
           <w:lang w:val="en-US"/>
         </w:rPr>
         <w:t>Vaostice</w:t>
       </w:r>
+      <w:proofErr w:type="spellEnd"/>
     </w:p>
     <w:p>
       <w:pPr>
@@ -656,25 +801,35 @@
           <w:lang w:val="en-US"/>
         </w:rPr>
       </w:pPr>
+      <w:proofErr w:type="spellStart"/>
       <w:r>
         <w:rPr>
           <w:lang w:val="en-US"/>
         </w:rPr>
         <w:t>Shkarhound</w:t>
       </w:r>
-    </w:p>
-    <w:p>
-      <w:pPr>
-        <w:rPr>
-          <w:lang w:val="en-US"/>
-        </w:rPr>
-      </w:pPr>
-      <w:r>
-        <w:rPr>
-          <w:lang w:val="en-US"/>
-        </w:rPr>
-        <w:t>Transformation into a Shkarhound</w:t>
-      </w:r>
+      <w:proofErr w:type="spellEnd"/>
+    </w:p>
+    <w:p>
+      <w:pPr>
+        <w:rPr>
+          <w:lang w:val="en-US"/>
+        </w:rPr>
+      </w:pPr>
+      <w:r>
+        <w:rPr>
+          <w:lang w:val="en-US"/>
+        </w:rPr>
+        <w:t xml:space="preserve">Transformation into a </w:t>
+      </w:r>
+      <w:proofErr w:type="spellStart"/>
+      <w:r>
+        <w:rPr>
+          <w:lang w:val="en-US"/>
+        </w:rPr>
+        <w:t>Shkarhound</w:t>
+      </w:r>
+      <w:proofErr w:type="spellEnd"/>
     </w:p>
     <w:p>
       <w:pPr>
@@ -710,12 +865,14 @@
           <w:lang w:val="en-US"/>
         </w:rPr>
       </w:pPr>
+      <w:proofErr w:type="spellStart"/>
       <w:r>
         <w:rPr>
           <w:lang w:val="en-US"/>
         </w:rPr>
         <w:t>Rustice</w:t>
       </w:r>
+      <w:proofErr w:type="spellEnd"/>
     </w:p>
     <w:p>
       <w:pPr>

</xml_diff>

<commit_message>
Deployed 8de05b1 with MkDocs version: 1.6.1
</commit_message>
<xml_diff>
--- a/Buch Camille Chronicles/Melodies.docx
+++ b/Buch Camille Chronicles/Melodies.docx
@@ -26,89 +26,33 @@
         <w:rPr>
           <w:lang w:val="en-US"/>
         </w:rPr>
-        <w:t xml:space="preserve">Melodies are a short assortment of tones that activate the </w:t>
-      </w:r>
-      <w:proofErr w:type="spellStart"/>
-      <w:r>
-        <w:rPr>
-          <w:lang w:val="en-US"/>
-        </w:rPr>
-        <w:t>Soulstice</w:t>
-      </w:r>
-      <w:proofErr w:type="spellEnd"/>
-      <w:r>
-        <w:rPr>
-          <w:lang w:val="en-US"/>
-        </w:rPr>
-        <w:t xml:space="preserve"> powers between Harmonist and Stice. </w:t>
-      </w:r>
-    </w:p>
-    <w:p>
-      <w:pPr>
-        <w:rPr>
-          <w:lang w:val="en-US"/>
-        </w:rPr>
-      </w:pPr>
-      <w:r>
-        <w:rPr>
-          <w:lang w:val="en-US"/>
-        </w:rPr>
-        <w:t xml:space="preserve">Is the bond of trust between Harmonist and Stice perfect, then they might play the Melodies with even greater effect and control, their passive senses and abilities even greater </w:t>
-      </w:r>
-      <w:proofErr w:type="spellStart"/>
-      <w:r>
-        <w:rPr>
-          <w:lang w:val="en-US"/>
-        </w:rPr>
-        <w:t>thatn</w:t>
-      </w:r>
-      <w:proofErr w:type="spellEnd"/>
-      <w:r>
-        <w:rPr>
-          <w:lang w:val="en-US"/>
-        </w:rPr>
-        <w:t xml:space="preserve"> before.</w:t>
-      </w:r>
-    </w:p>
-    <w:p>
-      <w:pPr>
-        <w:rPr>
-          <w:lang w:val="en-US"/>
-        </w:rPr>
-      </w:pPr>
-      <w:r>
-        <w:rPr>
-          <w:lang w:val="en-US"/>
-        </w:rPr>
-        <w:t xml:space="preserve">The Melodies of a specific </w:t>
-      </w:r>
-      <w:proofErr w:type="spellStart"/>
-      <w:r>
-        <w:rPr>
-          <w:lang w:val="en-US"/>
-        </w:rPr>
-        <w:t>Soulstice</w:t>
-      </w:r>
-      <w:proofErr w:type="spellEnd"/>
-      <w:r>
-        <w:rPr>
-          <w:lang w:val="en-US"/>
-        </w:rPr>
-        <w:t xml:space="preserve"> combine into a song that can be added upon in either direction. Though the song does have an end if all Melodies are discovered and learned by a Harmonist and played in the right order right behind each other. Then the Harmonist is truly ascended and can use the song freely to combine powers as they wish as well as gain special specific abilities depending on their </w:t>
-      </w:r>
-      <w:proofErr w:type="spellStart"/>
-      <w:r>
-        <w:rPr>
-          <w:lang w:val="en-US"/>
-        </w:rPr>
-        <w:t>Soulstice</w:t>
-      </w:r>
-      <w:proofErr w:type="spellEnd"/>
-      <w:r>
-        <w:rPr>
-          <w:lang w:val="en-US"/>
-        </w:rPr>
-        <w:t xml:space="preserve"> type.</w:t>
+        <w:t xml:space="preserve">Melodies are a short assortment of tones that activate the Soulstice powers between Harmonist and Stice. </w:t>
+      </w:r>
+    </w:p>
+    <w:p>
+      <w:pPr>
+        <w:rPr>
+          <w:lang w:val="en-US"/>
+        </w:rPr>
+      </w:pPr>
+      <w:r>
+        <w:rPr>
+          <w:lang w:val="en-US"/>
+        </w:rPr>
+        <w:t>Is the bond of trust between Harmonist and Stice perfect, then they might play the Melodies with even greater effect and control, their passive senses and abilities even greater thatn before.</w:t>
+      </w:r>
+    </w:p>
+    <w:p>
+      <w:pPr>
+        <w:rPr>
+          <w:lang w:val="en-US"/>
+        </w:rPr>
+      </w:pPr>
+      <w:r>
+        <w:rPr>
+          <w:lang w:val="en-US"/>
+        </w:rPr>
+        <w:t>The Melodies of a specific Soulstice combine into a song that can be added upon in either direction. Though the song does have an end if all Melodies are discovered and learned by a Harmonist and played in the right order right behind each other. Then the Harmonist is truly ascended and can use the song freely to combine powers as they wish as well as gain special specific abilities depending on their Soulstice type.</w:t>
       </w:r>
     </w:p>
     <w:p>
@@ -118,19 +62,11 @@
           <w:lang w:val="en-US"/>
         </w:rPr>
       </w:pPr>
-      <w:proofErr w:type="spellStart"/>
-      <w:r>
-        <w:rPr>
-          <w:lang w:val="en-US"/>
-        </w:rPr>
-        <w:t>Aikstice</w:t>
-      </w:r>
-      <w:proofErr w:type="spellEnd"/>
-      <w:r>
-        <w:rPr>
-          <w:lang w:val="en-US"/>
-        </w:rPr>
-        <w:t xml:space="preserve"> </w:t>
+      <w:r>
+        <w:rPr>
+          <w:lang w:val="en-US"/>
+        </w:rPr>
+        <w:t xml:space="preserve">Aikstice </w:t>
       </w:r>
     </w:p>
     <w:p>
@@ -210,21 +146,7 @@
         <w:rPr>
           <w:lang w:val="en-US"/>
         </w:rPr>
-        <w:t xml:space="preserve">and anything it </w:t>
-      </w:r>
-      <w:proofErr w:type="gramStart"/>
-      <w:r>
-        <w:rPr>
-          <w:lang w:val="en-US"/>
-        </w:rPr>
-        <w:t>touches</w:t>
-      </w:r>
-      <w:proofErr w:type="gramEnd"/>
-      <w:r>
-        <w:rPr>
-          <w:lang w:val="en-US"/>
-        </w:rPr>
-        <w:t xml:space="preserve"> </w:t>
+        <w:t xml:space="preserve">and anything it touches </w:t>
       </w:r>
       <w:r>
         <w:rPr>
@@ -296,7 +218,19 @@
         <w:rPr>
           <w:lang w:val="en-US"/>
         </w:rPr>
-        <w:t>Increases muscle size, bone density and limb range.</w:t>
+        <w:t>Increases muscle size, bone density and limb range</w:t>
+      </w:r>
+      <w:r>
+        <w:rPr>
+          <w:lang w:val="en-US"/>
+        </w:rPr>
+        <w:t xml:space="preserve"> to be agile and strong</w:t>
+      </w:r>
+      <w:r>
+        <w:rPr>
+          <w:lang w:val="en-US"/>
+        </w:rPr>
+        <w:t>.</w:t>
       </w:r>
     </w:p>
     <w:p>
@@ -355,13 +289,25 @@
     </w:p>
     <w:p>
       <w:pPr>
+        <w:rPr>
+          <w:lang w:val="en-US"/>
+        </w:rPr>
+      </w:pPr>
+      <w:r>
+        <w:rPr>
+          <w:lang w:val="en-US"/>
+        </w:rPr>
+        <w:t>Bulk</w:t>
+      </w:r>
+    </w:p>
+    <w:p>
+      <w:pPr>
         <w:pStyle w:val="berschrift2"/>
         <w:rPr>
           <w:lang w:val="en-US"/>
         </w:rPr>
       </w:pPr>
       <w:bookmarkStart w:id="0" w:name="_Hlk234175724"/>
-      <w:proofErr w:type="spellStart"/>
       <w:r>
         <w:rPr>
           <w:lang w:val="en-US"/>
@@ -369,7 +315,6 @@
         <w:lastRenderedPageBreak/>
         <w:t>Kerstice</w:t>
       </w:r>
-      <w:proofErr w:type="spellEnd"/>
     </w:p>
     <w:bookmarkEnd w:id="0"/>
     <w:p>
@@ -392,21 +337,23 @@
           <w:lang w:val="en-US"/>
         </w:rPr>
       </w:pPr>
-      <w:proofErr w:type="spellStart"/>
-      <w:proofErr w:type="gramStart"/>
-      <w:r>
-        <w:rPr>
-          <w:lang w:val="en-US"/>
-        </w:rPr>
-        <w:t>Lets</w:t>
-      </w:r>
-      <w:proofErr w:type="spellEnd"/>
-      <w:proofErr w:type="gramEnd"/>
-      <w:r>
-        <w:rPr>
-          <w:lang w:val="en-US"/>
-        </w:rPr>
-        <w:t xml:space="preserve"> the Harmonist amass and form stone and similar material into shapes of their will.</w:t>
+      <w:r>
+        <w:rPr>
+          <w:lang w:val="en-US"/>
+        </w:rPr>
+        <w:t>Lets the Harmonist amass and form stone and similar material into shapes of their will</w:t>
+      </w:r>
+      <w:r>
+        <w:rPr>
+          <w:lang w:val="en-US"/>
+        </w:rPr>
+        <w:t>, like pillars or sculptures even</w:t>
+      </w:r>
+      <w:r>
+        <w:rPr>
+          <w:lang w:val="en-US"/>
+        </w:rPr>
+        <w:t>.</w:t>
       </w:r>
     </w:p>
     <w:p>
@@ -549,19 +496,44 @@
     </w:p>
     <w:p>
       <w:pPr>
+        <w:pStyle w:val="berschrift3"/>
+        <w:rPr>
+          <w:lang w:val="en-US"/>
+        </w:rPr>
+      </w:pPr>
+      <w:r>
+        <w:rPr>
+          <w:lang w:val="en-US"/>
+        </w:rPr>
+        <w:t>Quake</w:t>
+      </w:r>
+    </w:p>
+    <w:p>
+      <w:pPr>
+        <w:rPr>
+          <w:lang w:val="en-US"/>
+        </w:rPr>
+      </w:pPr>
+      <w:r>
+        <w:rPr>
+          <w:lang w:val="en-US"/>
+        </w:rPr>
+        <w:t>Slamming an appendage into stone creates a strong but small earthquake, shaking up the touched stones and rock</w:t>
+      </w:r>
+    </w:p>
+    <w:p>
+      <w:pPr>
         <w:pStyle w:val="berschrift2"/>
         <w:rPr>
           <w:lang w:val="en-US"/>
         </w:rPr>
       </w:pPr>
-      <w:proofErr w:type="spellStart"/>
       <w:r>
         <w:rPr>
           <w:lang w:val="en-US"/>
         </w:rPr>
         <w:t>Vrastice</w:t>
       </w:r>
-      <w:proofErr w:type="spellEnd"/>
     </w:p>
     <w:p>
       <w:pPr>
@@ -644,14 +616,12 @@
           <w:lang w:val="en-US"/>
         </w:rPr>
       </w:pPr>
-      <w:proofErr w:type="spellStart"/>
       <w:r>
         <w:rPr>
           <w:lang w:val="en-US"/>
         </w:rPr>
         <w:t>Mishstice</w:t>
       </w:r>
-      <w:proofErr w:type="spellEnd"/>
     </w:p>
     <w:p>
       <w:pPr>
@@ -691,6 +661,7 @@
         <w:rPr>
           <w:lang w:val="en-US"/>
         </w:rPr>
+        <w:lastRenderedPageBreak/>
         <w:t>Flow</w:t>
       </w:r>
     </w:p>
@@ -714,15 +685,12 @@
           <w:lang w:val="en-US"/>
         </w:rPr>
       </w:pPr>
-      <w:proofErr w:type="spellStart"/>
-      <w:r>
-        <w:rPr>
-          <w:lang w:val="en-US"/>
-        </w:rPr>
-        <w:lastRenderedPageBreak/>
+      <w:r>
+        <w:rPr>
+          <w:lang w:val="en-US"/>
+        </w:rPr>
         <w:t>Tristice</w:t>
       </w:r>
-      <w:proofErr w:type="spellEnd"/>
     </w:p>
     <w:p>
       <w:pPr>
@@ -780,56 +748,71 @@
     </w:p>
     <w:p>
       <w:pPr>
+        <w:pStyle w:val="berschrift3"/>
+        <w:rPr>
+          <w:lang w:val="en-US"/>
+        </w:rPr>
+      </w:pPr>
+      <w:r>
+        <w:rPr>
+          <w:lang w:val="en-US"/>
+        </w:rPr>
+        <w:t>Whip</w:t>
+      </w:r>
+    </w:p>
+    <w:p>
+      <w:pPr>
+        <w:rPr>
+          <w:lang w:val="en-US"/>
+        </w:rPr>
+      </w:pPr>
+      <w:r>
+        <w:rPr>
+          <w:lang w:val="en-US"/>
+        </w:rPr>
+        <w:t>Creates a whip from nothing. Easier controlled by a stick or specialized tool for the Melody. Can be controlled like a tentacle.</w:t>
+      </w:r>
+    </w:p>
+    <w:p>
+      <w:pPr>
         <w:pStyle w:val="berschrift2"/>
         <w:rPr>
           <w:lang w:val="en-US"/>
         </w:rPr>
       </w:pPr>
-      <w:proofErr w:type="spellStart"/>
       <w:r>
         <w:rPr>
           <w:lang w:val="en-US"/>
         </w:rPr>
         <w:t>Vaostice</w:t>
       </w:r>
-      <w:proofErr w:type="spellEnd"/>
-    </w:p>
-    <w:p>
-      <w:pPr>
-        <w:pStyle w:val="berschrift3"/>
-        <w:rPr>
-          <w:lang w:val="en-US"/>
-        </w:rPr>
-      </w:pPr>
-      <w:proofErr w:type="spellStart"/>
+    </w:p>
+    <w:p>
+      <w:pPr>
+        <w:pStyle w:val="berschrift3"/>
+        <w:rPr>
+          <w:lang w:val="en-US"/>
+        </w:rPr>
+      </w:pPr>
       <w:r>
         <w:rPr>
           <w:lang w:val="en-US"/>
         </w:rPr>
         <w:t>Shkarhound</w:t>
       </w:r>
-      <w:proofErr w:type="spellEnd"/>
-    </w:p>
-    <w:p>
-      <w:pPr>
-        <w:rPr>
-          <w:lang w:val="en-US"/>
-        </w:rPr>
-      </w:pPr>
-      <w:r>
-        <w:rPr>
-          <w:lang w:val="en-US"/>
-        </w:rPr>
-        <w:t xml:space="preserve">Transformation into a </w:t>
-      </w:r>
-      <w:proofErr w:type="spellStart"/>
-      <w:r>
-        <w:rPr>
-          <w:lang w:val="en-US"/>
-        </w:rPr>
-        <w:t>Shkarhound</w:t>
-      </w:r>
-      <w:proofErr w:type="spellEnd"/>
+    </w:p>
+    <w:p>
+      <w:pPr>
+        <w:rPr>
+          <w:lang w:val="en-US"/>
+        </w:rPr>
+      </w:pPr>
+      <w:r>
+        <w:rPr>
+          <w:lang w:val="en-US"/>
+        </w:rPr>
+        <w:t>Transformation into a Shkarhound</w:t>
+      </w:r>
     </w:p>
     <w:p>
       <w:pPr>
@@ -865,14 +848,12 @@
           <w:lang w:val="en-US"/>
         </w:rPr>
       </w:pPr>
-      <w:proofErr w:type="spellStart"/>
       <w:r>
         <w:rPr>
           <w:lang w:val="en-US"/>
         </w:rPr>
         <w:t>Rustice</w:t>
       </w:r>
-      <w:proofErr w:type="spellEnd"/>
     </w:p>
     <w:p>
       <w:pPr>
@@ -899,6 +880,59 @@
           <w:lang w:val="en-US"/>
         </w:rPr>
         <w:t>Creates a blast of wind that can be directed anywhere. Has lots of powers that is quickly lost over 10-20 meters.</w:t>
+      </w:r>
+    </w:p>
+    <w:p>
+      <w:pPr>
+        <w:pStyle w:val="berschrift2"/>
+        <w:rPr>
+          <w:lang w:val="en-US"/>
+        </w:rPr>
+      </w:pPr>
+      <w:r>
+        <w:rPr>
+          <w:lang w:val="en-US"/>
+        </w:rPr>
+        <w:t>Nelstice</w:t>
+      </w:r>
+    </w:p>
+    <w:p>
+      <w:pPr>
+        <w:pStyle w:val="berschrift3"/>
+        <w:rPr>
+          <w:lang w:val="en-US"/>
+        </w:rPr>
+      </w:pPr>
+      <w:r>
+        <w:rPr>
+          <w:lang w:val="en-US"/>
+        </w:rPr>
+        <w:t>Casing</w:t>
+      </w:r>
+    </w:p>
+    <w:p>
+      <w:pPr>
+        <w:rPr>
+          <w:lang w:val="en-US"/>
+        </w:rPr>
+      </w:pPr>
+      <w:r>
+        <w:rPr>
+          <w:lang w:val="en-US"/>
+        </w:rPr>
+        <w:t>Forms a</w:t>
+      </w:r>
+      <w:r>
+        <w:rPr>
+          <w:lang w:val="en-US"/>
+        </w:rPr>
+        <w:t xml:space="preserve"> living</w:t>
+      </w:r>
+      <w:r>
+        <w:rPr>
+          <w:lang w:val="en-US"/>
+        </w:rPr>
+        <w:t xml:space="preserve"> armor of bark and roots around the Harmonist, increasing their defense and strengthening their body through the power granted by additional plant like muscles.</w:t>
       </w:r>
     </w:p>
     <w:p>

</xml_diff>

<commit_message>
Deployed 4809e8a with MkDocs version: 1.6.1
</commit_message>
<xml_diff>
--- a/Buch Camille Chronicles/Melodies.docx
+++ b/Buch Camille Chronicles/Melodies.docx
@@ -26,33 +26,89 @@
         <w:rPr>
           <w:lang w:val="en-US"/>
         </w:rPr>
-        <w:t xml:space="preserve">Melodies are a short assortment of tones that activate the Soulstice powers between Harmonist and Stice. </w:t>
-      </w:r>
-    </w:p>
-    <w:p>
-      <w:pPr>
-        <w:rPr>
-          <w:lang w:val="en-US"/>
-        </w:rPr>
-      </w:pPr>
-      <w:r>
-        <w:rPr>
-          <w:lang w:val="en-US"/>
-        </w:rPr>
-        <w:t>Is the bond of trust between Harmonist and Stice perfect, then they might play the Melodies with even greater effect and control, their passive senses and abilities even greater thatn before.</w:t>
-      </w:r>
-    </w:p>
-    <w:p>
-      <w:pPr>
-        <w:rPr>
-          <w:lang w:val="en-US"/>
-        </w:rPr>
-      </w:pPr>
-      <w:r>
-        <w:rPr>
-          <w:lang w:val="en-US"/>
-        </w:rPr>
-        <w:t>The Melodies of a specific Soulstice combine into a song that can be added upon in either direction. Though the song does have an end if all Melodies are discovered and learned by a Harmonist and played in the right order right behind each other. Then the Harmonist is truly ascended and can use the song freely to combine powers as they wish as well as gain special specific abilities depending on their Soulstice type.</w:t>
+        <w:t xml:space="preserve">Melodies are a short assortment of tones that activate the </w:t>
+      </w:r>
+      <w:proofErr w:type="spellStart"/>
+      <w:r>
+        <w:rPr>
+          <w:lang w:val="en-US"/>
+        </w:rPr>
+        <w:t>Soulstice</w:t>
+      </w:r>
+      <w:proofErr w:type="spellEnd"/>
+      <w:r>
+        <w:rPr>
+          <w:lang w:val="en-US"/>
+        </w:rPr>
+        <w:t xml:space="preserve"> powers between Harmonist and Stice. </w:t>
+      </w:r>
+    </w:p>
+    <w:p>
+      <w:pPr>
+        <w:rPr>
+          <w:lang w:val="en-US"/>
+        </w:rPr>
+      </w:pPr>
+      <w:r>
+        <w:rPr>
+          <w:lang w:val="en-US"/>
+        </w:rPr>
+        <w:t xml:space="preserve">Is the bond of trust between Harmonist and Stice perfect, then they might play the Melodies with even greater effect and control, their passive senses and abilities even greater </w:t>
+      </w:r>
+      <w:proofErr w:type="spellStart"/>
+      <w:r>
+        <w:rPr>
+          <w:lang w:val="en-US"/>
+        </w:rPr>
+        <w:t>thatn</w:t>
+      </w:r>
+      <w:proofErr w:type="spellEnd"/>
+      <w:r>
+        <w:rPr>
+          <w:lang w:val="en-US"/>
+        </w:rPr>
+        <w:t xml:space="preserve"> before.</w:t>
+      </w:r>
+    </w:p>
+    <w:p>
+      <w:pPr>
+        <w:rPr>
+          <w:lang w:val="en-US"/>
+        </w:rPr>
+      </w:pPr>
+      <w:r>
+        <w:rPr>
+          <w:lang w:val="en-US"/>
+        </w:rPr>
+        <w:t xml:space="preserve">The Melodies of a specific </w:t>
+      </w:r>
+      <w:proofErr w:type="spellStart"/>
+      <w:r>
+        <w:rPr>
+          <w:lang w:val="en-US"/>
+        </w:rPr>
+        <w:t>Soulstice</w:t>
+      </w:r>
+      <w:proofErr w:type="spellEnd"/>
+      <w:r>
+        <w:rPr>
+          <w:lang w:val="en-US"/>
+        </w:rPr>
+        <w:t xml:space="preserve"> combine into a song that can be added upon in either direction. Though the song does have an end if all Melodies are discovered and learned by a Harmonist and played in the right order right behind each other. Then the Harmonist is truly ascended and can use the song freely to combine powers as they wish as well as gain special specific abilities depending on their </w:t>
+      </w:r>
+      <w:proofErr w:type="spellStart"/>
+      <w:r>
+        <w:rPr>
+          <w:lang w:val="en-US"/>
+        </w:rPr>
+        <w:t>Soulstice</w:t>
+      </w:r>
+      <w:proofErr w:type="spellEnd"/>
+      <w:r>
+        <w:rPr>
+          <w:lang w:val="en-US"/>
+        </w:rPr>
+        <w:t xml:space="preserve"> type.</w:t>
       </w:r>
     </w:p>
     <w:p>
@@ -62,11 +118,19 @@
           <w:lang w:val="en-US"/>
         </w:rPr>
       </w:pPr>
-      <w:r>
-        <w:rPr>
-          <w:lang w:val="en-US"/>
-        </w:rPr>
-        <w:t xml:space="preserve">Aikstice </w:t>
+      <w:proofErr w:type="spellStart"/>
+      <w:r>
+        <w:rPr>
+          <w:lang w:val="en-US"/>
+        </w:rPr>
+        <w:t>Aikstice</w:t>
+      </w:r>
+      <w:proofErr w:type="spellEnd"/>
+      <w:r>
+        <w:rPr>
+          <w:lang w:val="en-US"/>
+        </w:rPr>
+        <w:t xml:space="preserve"> </w:t>
       </w:r>
     </w:p>
     <w:p>
@@ -146,7 +210,21 @@
         <w:rPr>
           <w:lang w:val="en-US"/>
         </w:rPr>
-        <w:t xml:space="preserve">and anything it touches </w:t>
+        <w:t xml:space="preserve">and anything it </w:t>
+      </w:r>
+      <w:proofErr w:type="gramStart"/>
+      <w:r>
+        <w:rPr>
+          <w:lang w:val="en-US"/>
+        </w:rPr>
+        <w:t>touches</w:t>
+      </w:r>
+      <w:proofErr w:type="gramEnd"/>
+      <w:r>
+        <w:rPr>
+          <w:lang w:val="en-US"/>
+        </w:rPr>
+        <w:t xml:space="preserve"> </w:t>
       </w:r>
       <w:r>
         <w:rPr>
@@ -308,6 +386,7 @@
         </w:rPr>
       </w:pPr>
       <w:bookmarkStart w:id="0" w:name="_Hlk234175724"/>
+      <w:proofErr w:type="spellStart"/>
       <w:r>
         <w:rPr>
           <w:lang w:val="en-US"/>
@@ -315,6 +394,7 @@
         <w:lastRenderedPageBreak/>
         <w:t>Kerstice</w:t>
       </w:r>
+      <w:proofErr w:type="spellEnd"/>
     </w:p>
     <w:bookmarkEnd w:id="0"/>
     <w:p>
@@ -337,11 +417,21 @@
           <w:lang w:val="en-US"/>
         </w:rPr>
       </w:pPr>
-      <w:r>
-        <w:rPr>
-          <w:lang w:val="en-US"/>
-        </w:rPr>
-        <w:t>Lets the Harmonist amass and form stone and similar material into shapes of their will</w:t>
+      <w:proofErr w:type="spellStart"/>
+      <w:proofErr w:type="gramStart"/>
+      <w:r>
+        <w:rPr>
+          <w:lang w:val="en-US"/>
+        </w:rPr>
+        <w:t>Lets</w:t>
+      </w:r>
+      <w:proofErr w:type="spellEnd"/>
+      <w:proofErr w:type="gramEnd"/>
+      <w:r>
+        <w:rPr>
+          <w:lang w:val="en-US"/>
+        </w:rPr>
+        <w:t xml:space="preserve"> the Harmonist amass and form stone and similar material into shapes of their will</w:t>
       </w:r>
       <w:r>
         <w:rPr>
@@ -491,7 +581,21 @@
         <w:rPr>
           <w:lang w:val="en-US"/>
         </w:rPr>
-        <w:t>Lifts ground into the air while it still ahs to hold contact with the Harmonist. Interconnection between stones and earth still continues, that’s why a massive wave of sand can be formed as well.</w:t>
+        <w:t xml:space="preserve">Lifts ground into the air while it still </w:t>
+      </w:r>
+      <w:proofErr w:type="spellStart"/>
+      <w:r>
+        <w:rPr>
+          <w:lang w:val="en-US"/>
+        </w:rPr>
+        <w:t>ahs</w:t>
+      </w:r>
+      <w:proofErr w:type="spellEnd"/>
+      <w:r>
+        <w:rPr>
+          <w:lang w:val="en-US"/>
+        </w:rPr>
+        <w:t xml:space="preserve"> to hold contact with the Harmonist. Interconnection between stones and earth still continues, that’s why a massive wave of sand can be formed as well.</w:t>
       </w:r>
     </w:p>
     <w:p>
@@ -528,12 +632,14 @@
           <w:lang w:val="en-US"/>
         </w:rPr>
       </w:pPr>
+      <w:proofErr w:type="spellStart"/>
       <w:r>
         <w:rPr>
           <w:lang w:val="en-US"/>
         </w:rPr>
         <w:t>Vrastice</w:t>
       </w:r>
+      <w:proofErr w:type="spellEnd"/>
     </w:p>
     <w:p>
       <w:pPr>
@@ -616,12 +722,14 @@
           <w:lang w:val="en-US"/>
         </w:rPr>
       </w:pPr>
+      <w:proofErr w:type="spellStart"/>
       <w:r>
         <w:rPr>
           <w:lang w:val="en-US"/>
         </w:rPr>
         <w:t>Mishstice</w:t>
       </w:r>
+      <w:proofErr w:type="spellEnd"/>
     </w:p>
     <w:p>
       <w:pPr>
@@ -647,7 +755,25 @@
         <w:rPr>
           <w:lang w:val="en-US"/>
         </w:rPr>
-        <w:t>Creating armor around something, be it your own body, someone else or something entirely different.</w:t>
+        <w:t>Creating armor</w:t>
+      </w:r>
+      <w:r>
+        <w:rPr>
+          <w:lang w:val="en-US"/>
+        </w:rPr>
+        <w:t xml:space="preserve"> of steel</w:t>
+      </w:r>
+      <w:r>
+        <w:rPr>
+          <w:lang w:val="en-US"/>
+        </w:rPr>
+        <w:t xml:space="preserve"> around something, be it your own body, someone else or something entirely different.</w:t>
+      </w:r>
+      <w:r>
+        <w:rPr>
+          <w:lang w:val="en-US"/>
+        </w:rPr>
+        <w:t xml:space="preserve"> In essence a shell that hardens.</w:t>
       </w:r>
     </w:p>
     <w:p>
@@ -675,7 +801,58 @@
         <w:rPr>
           <w:lang w:val="en-US"/>
         </w:rPr>
-        <w:t>Creating a batch of flowing metal that can be formed and hardened by will.</w:t>
+        <w:t xml:space="preserve">Creating a batch of flowing </w:t>
+      </w:r>
+      <w:r>
+        <w:rPr>
+          <w:lang w:val="en-US"/>
+        </w:rPr>
+        <w:t>steel</w:t>
+      </w:r>
+      <w:r>
+        <w:rPr>
+          <w:lang w:val="en-US"/>
+        </w:rPr>
+        <w:t xml:space="preserve"> that can be forme</w:t>
+      </w:r>
+      <w:r>
+        <w:rPr>
+          <w:lang w:val="en-US"/>
+        </w:rPr>
+        <w:t>d at</w:t>
+      </w:r>
+      <w:r>
+        <w:rPr>
+          <w:lang w:val="en-US"/>
+        </w:rPr>
+        <w:t xml:space="preserve"> will.</w:t>
+      </w:r>
+    </w:p>
+    <w:p>
+      <w:pPr>
+        <w:pStyle w:val="berschrift3"/>
+        <w:rPr>
+          <w:lang w:val="en-US"/>
+        </w:rPr>
+      </w:pPr>
+      <w:r>
+        <w:rPr>
+          <w:lang w:val="en-US"/>
+        </w:rPr>
+        <w:t>Bend</w:t>
+      </w:r>
+    </w:p>
+    <w:p>
+      <w:pPr>
+        <w:rPr>
+          <w:lang w:val="en-US"/>
+        </w:rPr>
+      </w:pPr>
+      <w:r>
+        <w:rPr>
+          <w:lang w:val="en-US"/>
+        </w:rPr>
+        <w:t>Bends and forms existing steel to the Harmonists will. The steel needs to be touched.</w:t>
       </w:r>
     </w:p>
     <w:p>
@@ -685,12 +862,14 @@
           <w:lang w:val="en-US"/>
         </w:rPr>
       </w:pPr>
+      <w:proofErr w:type="spellStart"/>
       <w:r>
         <w:rPr>
           <w:lang w:val="en-US"/>
         </w:rPr>
         <w:t>Tristice</w:t>
       </w:r>
+      <w:proofErr w:type="spellEnd"/>
     </w:p>
     <w:p>
       <w:pPr>
@@ -780,39 +959,51 @@
           <w:lang w:val="en-US"/>
         </w:rPr>
       </w:pPr>
+      <w:proofErr w:type="spellStart"/>
       <w:r>
         <w:rPr>
           <w:lang w:val="en-US"/>
         </w:rPr>
         <w:t>Vaostice</w:t>
       </w:r>
-    </w:p>
-    <w:p>
-      <w:pPr>
-        <w:pStyle w:val="berschrift3"/>
-        <w:rPr>
-          <w:lang w:val="en-US"/>
-        </w:rPr>
-      </w:pPr>
+      <w:proofErr w:type="spellEnd"/>
+    </w:p>
+    <w:p>
+      <w:pPr>
+        <w:pStyle w:val="berschrift3"/>
+        <w:rPr>
+          <w:lang w:val="en-US"/>
+        </w:rPr>
+      </w:pPr>
+      <w:proofErr w:type="spellStart"/>
       <w:r>
         <w:rPr>
           <w:lang w:val="en-US"/>
         </w:rPr>
         <w:t>Shkarhound</w:t>
       </w:r>
-    </w:p>
-    <w:p>
-      <w:pPr>
-        <w:rPr>
-          <w:lang w:val="en-US"/>
-        </w:rPr>
-      </w:pPr>
-      <w:r>
-        <w:rPr>
-          <w:lang w:val="en-US"/>
-        </w:rPr>
-        <w:t>Transformation into a Shkarhound</w:t>
-      </w:r>
+      <w:proofErr w:type="spellEnd"/>
+    </w:p>
+    <w:p>
+      <w:pPr>
+        <w:rPr>
+          <w:lang w:val="en-US"/>
+        </w:rPr>
+      </w:pPr>
+      <w:r>
+        <w:rPr>
+          <w:lang w:val="en-US"/>
+        </w:rPr>
+        <w:t xml:space="preserve">Transformation into a </w:t>
+      </w:r>
+      <w:proofErr w:type="spellStart"/>
+      <w:r>
+        <w:rPr>
+          <w:lang w:val="en-US"/>
+        </w:rPr>
+        <w:t>Shkarhound</w:t>
+      </w:r>
+      <w:proofErr w:type="spellEnd"/>
     </w:p>
     <w:p>
       <w:pPr>
@@ -848,12 +1039,14 @@
           <w:lang w:val="en-US"/>
         </w:rPr>
       </w:pPr>
+      <w:proofErr w:type="spellStart"/>
       <w:r>
         <w:rPr>
           <w:lang w:val="en-US"/>
         </w:rPr>
         <w:t>Rustice</w:t>
       </w:r>
+      <w:proofErr w:type="spellEnd"/>
     </w:p>
     <w:p>
       <w:pPr>
@@ -889,12 +1082,14 @@
           <w:lang w:val="en-US"/>
         </w:rPr>
       </w:pPr>
+      <w:proofErr w:type="spellStart"/>
       <w:r>
         <w:rPr>
           <w:lang w:val="en-US"/>
         </w:rPr>
         <w:t>Nelstice</w:t>
       </w:r>
+      <w:proofErr w:type="spellEnd"/>
     </w:p>
     <w:p>
       <w:pPr>
@@ -932,7 +1127,21 @@
         <w:rPr>
           <w:lang w:val="en-US"/>
         </w:rPr>
-        <w:t xml:space="preserve"> armor of bark and roots around the Harmonist, increasing their defense and strengthening their body through the power granted by additional plant like muscles.</w:t>
+        <w:t xml:space="preserve"> armor of bark and roots around the Harmonist, increasing their defense and strengthening their body through the power granted by additional </w:t>
+      </w:r>
+      <w:proofErr w:type="gramStart"/>
+      <w:r>
+        <w:rPr>
+          <w:lang w:val="en-US"/>
+        </w:rPr>
+        <w:t>plant like</w:t>
+      </w:r>
+      <w:proofErr w:type="gramEnd"/>
+      <w:r>
+        <w:rPr>
+          <w:lang w:val="en-US"/>
+        </w:rPr>
+        <w:t xml:space="preserve"> muscles.</w:t>
       </w:r>
     </w:p>
     <w:p>
@@ -1425,7 +1634,6 @@
     <w:next w:val="Standard"/>
     <w:link w:val="berschrift4Zchn"/>
     <w:uiPriority w:val="9"/>
-    <w:semiHidden/>
     <w:unhideWhenUsed/>
     <w:qFormat/>
     <w:rsid w:val="00E8372A"/>
@@ -1622,7 +1830,6 @@
     <w:basedOn w:val="Absatz-Standardschriftart"/>
     <w:link w:val="berschrift4"/>
     <w:uiPriority w:val="9"/>
-    <w:semiHidden/>
     <w:rsid w:val="00E8372A"/>
     <w:rPr>
       <w:rFonts w:eastAsiaTheme="majorEastAsia" w:cstheme="majorBidi"/>

</xml_diff>